<commit_message>
docs: add security policy and frontend license index
- SECURITY.md: supported versions, private reporting path, credential guidance
- generate frontend-dependency-licenses.json from front/package-lock.json
- link both license indexes, CONTRIBUTING, CHANGELOG and SECURITY from README
- refresh the contest report cover to ccf2026-final / f1193a6
</commit_message>
<xml_diff>
--- a/docs/reports/AgentFence_Lite_参赛技术文档_ccf2026.docx
+++ b/docs/reports/AgentFence_Lite_参赛技术文档_ccf2026.docx
@@ -93,7 +93,7 @@
           <w:color w:val="1F3329"/>
           <w:sz w:val="20"/>
         </w:rPr>
-        <w:t>评审版本  ccf2026-initial</w:t>
+        <w:t>评审版本  ccf2026-final</w:t>
       </w:r>
     </w:p>
     <w:p>
@@ -108,7 +108,7 @@
           <w:color w:val="1F3329"/>
           <w:sz w:val="20"/>
         </w:rPr>
-        <w:t>对应提交  4073033</w:t>
+        <w:t>对应提交  f1193a6</w:t>
       </w:r>
     </w:p>
     <w:p>
@@ -193,7 +193,7 @@
           <w:color w:val="1F3329"/>
           <w:sz w:val="21"/>
         </w:rPr>
-        <w:t>AgentFence Lite 是一个用 Rust 实现的任务感知工具权限网关。它不生产 Agent，而是为外部 AI Agent 的文件工具调用提供统一入口：每次读写在服务端依次通过身份、阶段、精确路径与写租约四项判定，执行前后分别写入 intent 与 result 审计；工作区以不可变快照或隔离副本的形式提供，修改必须由管理员逐文件确认后才写回原项目。当前版本通过 MCP stdio 接入 DeepSeek Harness，Rust 与前端测试合计 170 项、Python 单测 162 项，主分支 CI 全绿，评审版本为 tag ccf2026-initial。</w:t>
+        <w:t>AgentFence Lite 是一个用 Rust 实现的任务感知工具权限网关。它不生产 Agent，而是为外部 AI Agent 的文件工具调用提供统一入口：每次读写在服务端依次通过身份、阶段、精确路径与写租约四项判定，执行前后分别写入 intent 与 result 审计；工作区以不可变快照或隔离副本的形式提供，修改必须由管理员逐文件确认后才写回原项目。当前版本通过 MCP stdio 接入 DeepSeek Harness，Rust 与前端测试合计 170 项、Python 单测 162 项，主分支 CI 全绿，评审版本为 tag ccf2026-final。</w:t>
       </w:r>
     </w:p>
     <w:p>
@@ -3215,7 +3215,7 @@
           <w:color w:val="5F7266"/>
           <w:sz w:val="18"/>
         </w:rPr>
-        <w:t>主分支 CI 的 Dashboard、Rust 与 V2 B 三条流水线均为 success；评审版本 tag 指向合并提交 4073033。</w:t>
+        <w:t>主分支 CI 的 Dashboard、Rust 与 V2 B 三条流水线均为 success；评审版本 tag 指向提交 f1193a6。</w:t>
       </w:r>
     </w:p>
     <w:p>
@@ -4758,7 +4758,7 @@
           <w:color w:val="1F3329"/>
           <w:sz w:val="19"/>
         </w:rPr>
-        <w:t>仓库：github.com/shishuishuia/AgentFence    评审版本：tag ccf2026-initial（commit 4073033）</w:t>
+        <w:t>仓库：github.com/shishuishuia/AgentFence    评审版本：tag ccf2026-final（commit f1193a6）</w:t>
       </w:r>
     </w:p>
     <w:p>

</xml_diff>

<commit_message>
docs: use the official project name across README, UI and report
</commit_message>
<xml_diff>
--- a/docs/reports/AgentFence_Lite_参赛技术文档_ccf2026.docx
+++ b/docs/reports/AgentFence_Lite_参赛技术文档_ccf2026.docx
@@ -63,7 +63,7 @@
           <w:color w:val="2F5D44"/>
           <w:sz w:val="32"/>
         </w:rPr>
-        <w:t>面向 AI Agent 的任务感知工具权限网关</w:t>
+        <w:t>基于 Rust 的 AI Agent 文件操作权限网关</w:t>
       </w:r>
     </w:p>
     <w:p>
@@ -193,7 +193,7 @@
           <w:color w:val="1F3329"/>
           <w:sz w:val="21"/>
         </w:rPr>
-        <w:t>AgentFence Lite 是一个用 Rust 实现的任务感知工具权限网关。它不生产 Agent，而是为外部 AI Agent 的文件工具调用提供统一入口：每次读写在服务端依次通过身份、阶段、精确路径与写租约四项判定，执行前后分别写入 intent 与 result 审计；工作区以不可变快照或隔离副本的形式提供，修改必须由管理员逐文件确认后才写回原项目。当前版本通过 MCP stdio 接入 DeepSeek Harness，Rust 与前端测试合计 170 项、Python 单测 162 项，主分支 CI 全绿，评审版本为 tag ccf2026-final。</w:t>
+        <w:t>AgentFence Lite 是一个基于 Rust 的 AI Agent 文件操作权限网关。它不生产 Agent，而是为外部 AI Agent 的文件工具调用提供统一入口：每次读写在服务端依次通过身份、阶段、精确路径与写租约四项判定，执行前后分别写入 intent 与 result 审计；工作区以不可变快照或隔离副本的形式提供，修改必须由管理员逐文件确认后才写回原项目。当前版本通过 MCP stdio 接入 DeepSeek Harness，Rust 与前端测试合计 170 项、Python 单测 162 项，主分支 CI 全绿，评审版本为 tag ccf2026-final。</w:t>
       </w:r>
     </w:p>
     <w:p>

</xml_diff>